<commit_message>
fin de inf. conclusion
</commit_message>
<xml_diff>
--- a/templates_word/INF. DE CONCLUSION PLANTILLA.docx
+++ b/templates_word/INF. DE CONCLUSION PLANTILLA.docx
@@ -609,8 +609,19 @@
           <w:sz w:val="18"/>
           <w:szCs w:val="18"/>
         </w:rPr>
-        <w:t>REF       :</w:t>
-      </w:r>
+        <w:t xml:space="preserve">REF     </w:t>
+      </w:r>
+      <w:proofErr w:type="gramStart"/>
+      <w:r>
+        <w:rPr>
+          <w:b/>
+          <w:color w:val="000000" w:themeColor="text1"/>
+          <w:sz w:val="18"/>
+          <w:szCs w:val="18"/>
+        </w:rPr>
+        <w:t xml:space="preserve">  :</w:t>
+      </w:r>
+      <w:proofErr w:type="gramEnd"/>
       <w:r>
         <w:rPr>
           <w:b/>
@@ -1482,7 +1493,25 @@
           <w:color w:val="000000" w:themeColor="text1"/>
           <w:sz w:val="20"/>
         </w:rPr>
-        <w:t xml:space="preserve">{{nombre_mayus}} </w:t>
+        <w:t>{{</w:t>
+      </w:r>
+      <w:proofErr w:type="spellStart"/>
+      <w:r>
+        <w:rPr>
+          <w:b/>
+          <w:color w:val="000000" w:themeColor="text1"/>
+          <w:sz w:val="20"/>
+        </w:rPr>
+        <w:t>nombre_mayus</w:t>
+      </w:r>
+      <w:proofErr w:type="spellEnd"/>
+      <w:r>
+        <w:rPr>
+          <w:b/>
+          <w:color w:val="000000" w:themeColor="text1"/>
+          <w:sz w:val="20"/>
+        </w:rPr>
+        <w:t xml:space="preserve">}} </w:t>
       </w:r>
       <w:r>
         <w:rPr>
@@ -3049,7 +3078,25 @@
           <w:color w:val="000000" w:themeColor="text1"/>
           <w:sz w:val="20"/>
         </w:rPr>
-        <w:t>{{nombre_mayus}}</w:t>
+        <w:t>{{</w:t>
+      </w:r>
+      <w:proofErr w:type="spellStart"/>
+      <w:r>
+        <w:rPr>
+          <w:b/>
+          <w:color w:val="000000" w:themeColor="text1"/>
+          <w:sz w:val="20"/>
+        </w:rPr>
+        <w:t>nombre_mayus</w:t>
+      </w:r>
+      <w:proofErr w:type="spellEnd"/>
+      <w:r>
+        <w:rPr>
+          <w:b/>
+          <w:color w:val="000000" w:themeColor="text1"/>
+          <w:sz w:val="20"/>
+        </w:rPr>
+        <w:t>}}</w:t>
       </w:r>
       <w:r>
         <w:rPr>
@@ -4152,7 +4199,25 @@
           <w:color w:val="000000" w:themeColor="text1"/>
           <w:sz w:val="20"/>
         </w:rPr>
-        <w:t xml:space="preserve">{{nombre_mayus}} </w:t>
+        <w:t>{{</w:t>
+      </w:r>
+      <w:proofErr w:type="spellStart"/>
+      <w:r>
+        <w:rPr>
+          <w:b/>
+          <w:color w:val="000000" w:themeColor="text1"/>
+          <w:sz w:val="20"/>
+        </w:rPr>
+        <w:t>nombre_mayus</w:t>
+      </w:r>
+      <w:proofErr w:type="spellEnd"/>
+      <w:r>
+        <w:rPr>
+          <w:b/>
+          <w:color w:val="000000" w:themeColor="text1"/>
+          <w:sz w:val="20"/>
+        </w:rPr>
+        <w:t xml:space="preserve">}} </w:t>
       </w:r>
       <w:r>
         <w:rPr>
@@ -4289,7 +4354,25 @@
           <w:color w:val="000000" w:themeColor="text1"/>
           <w:sz w:val="20"/>
         </w:rPr>
-        <w:t xml:space="preserve">{{nombre_mayus}} </w:t>
+        <w:t>{{</w:t>
+      </w:r>
+      <w:proofErr w:type="spellStart"/>
+      <w:r>
+        <w:rPr>
+          <w:b/>
+          <w:color w:val="000000" w:themeColor="text1"/>
+          <w:sz w:val="20"/>
+        </w:rPr>
+        <w:t>nombre_mayus</w:t>
+      </w:r>
+      <w:proofErr w:type="spellEnd"/>
+      <w:r>
+        <w:rPr>
+          <w:b/>
+          <w:color w:val="000000" w:themeColor="text1"/>
+          <w:sz w:val="20"/>
+        </w:rPr>
+        <w:t xml:space="preserve">}} </w:t>
       </w:r>
       <w:r>
         <w:rPr>
@@ -4761,7 +4844,29 @@
                 <w:sz w:val="16"/>
                 <w:szCs w:val="16"/>
               </w:rPr>
-              <w:t xml:space="preserve"> a in asistencias %}</w:t>
+              <w:t xml:space="preserve"> a </w:t>
+            </w:r>
+            <w:proofErr w:type="gramStart"/>
+            <w:r>
+              <w:rPr>
+                <w:rFonts w:eastAsia="MS Mincho"/>
+                <w:b w:val="0"/>
+                <w:bCs w:val="0"/>
+                <w:sz w:val="16"/>
+                <w:szCs w:val="16"/>
+              </w:rPr>
+              <w:t>in asistencias</w:t>
+            </w:r>
+            <w:proofErr w:type="gramEnd"/>
+            <w:r>
+              <w:rPr>
+                <w:rFonts w:eastAsia="MS Mincho"/>
+                <w:b w:val="0"/>
+                <w:bCs w:val="0"/>
+                <w:sz w:val="16"/>
+                <w:szCs w:val="16"/>
+              </w:rPr>
+              <w:t xml:space="preserve"> %}</w:t>
             </w:r>
           </w:p>
         </w:tc>
@@ -4861,6 +4966,7 @@
               <w:t xml:space="preserve"> </w:t>
             </w:r>
             <w:proofErr w:type="spellStart"/>
+            <w:proofErr w:type="gramStart"/>
             <w:r>
               <w:rPr>
                 <w:sz w:val="16"/>
@@ -4869,6 +4975,7 @@
               <w:t>loop.first</w:t>
             </w:r>
             <w:proofErr w:type="spellEnd"/>
+            <w:proofErr w:type="gramEnd"/>
             <w:r>
               <w:rPr>
                 <w:sz w:val="16"/>
@@ -4964,7 +5071,27 @@
                 <w:sz w:val="16"/>
                 <w:szCs w:val="16"/>
               </w:rPr>
-              <w:t>{{a.fecha}}</w:t>
+              <w:t>{{</w:t>
+            </w:r>
+            <w:proofErr w:type="gramStart"/>
+            <w:r>
+              <w:rPr>
+                <w:rFonts w:eastAsia="MS Mincho"/>
+                <w:b/>
+                <w:sz w:val="16"/>
+                <w:szCs w:val="16"/>
+              </w:rPr>
+              <w:t>a.fecha</w:t>
+            </w:r>
+            <w:proofErr w:type="gramEnd"/>
+            <w:r>
+              <w:rPr>
+                <w:rFonts w:eastAsia="MS Mincho"/>
+                <w:b/>
+                <w:sz w:val="16"/>
+                <w:szCs w:val="16"/>
+              </w:rPr>
+              <w:t>}}</w:t>
             </w:r>
           </w:p>
         </w:tc>
@@ -4990,7 +5117,27 @@
                 <w:sz w:val="16"/>
                 <w:szCs w:val="16"/>
               </w:rPr>
-              <w:t>{{a.actividad}}</w:t>
+              <w:t>{{</w:t>
+            </w:r>
+            <w:proofErr w:type="gramStart"/>
+            <w:r>
+              <w:rPr>
+                <w:rFonts w:eastAsia="MS Mincho"/>
+                <w:b/>
+                <w:sz w:val="16"/>
+                <w:szCs w:val="16"/>
+              </w:rPr>
+              <w:t>a.actividad</w:t>
+            </w:r>
+            <w:proofErr w:type="gramEnd"/>
+            <w:r>
+              <w:rPr>
+                <w:rFonts w:eastAsia="MS Mincho"/>
+                <w:b/>
+                <w:sz w:val="16"/>
+                <w:szCs w:val="16"/>
+              </w:rPr>
+              <w:t>}}</w:t>
             </w:r>
           </w:p>
         </w:tc>
@@ -5016,7 +5163,27 @@
                 <w:sz w:val="16"/>
                 <w:szCs w:val="16"/>
               </w:rPr>
-              <w:t>{{a.asistencia}}</w:t>
+              <w:t>{{</w:t>
+            </w:r>
+            <w:proofErr w:type="gramStart"/>
+            <w:r>
+              <w:rPr>
+                <w:rFonts w:eastAsia="MS Mincho"/>
+                <w:b/>
+                <w:sz w:val="16"/>
+                <w:szCs w:val="16"/>
+              </w:rPr>
+              <w:t>a.asistencia</w:t>
+            </w:r>
+            <w:proofErr w:type="gramEnd"/>
+            <w:r>
+              <w:rPr>
+                <w:rFonts w:eastAsia="MS Mincho"/>
+                <w:b/>
+                <w:sz w:val="16"/>
+                <w:szCs w:val="16"/>
+              </w:rPr>
+              <w:t>}}</w:t>
             </w:r>
           </w:p>
         </w:tc>
@@ -6279,6 +6446,7 @@
                 <w:szCs w:val="14"/>
               </w:rPr>
             </w:pPr>
+            <w:proofErr w:type="gramStart"/>
             <w:r>
               <w:rPr>
                 <w:rFonts w:eastAsia="MS Mincho" w:cstheme="minorHAnsi"/>
@@ -6288,6 +6456,7 @@
               </w:rPr>
               <w:t>JORNADAS A TRABAJAR</w:t>
             </w:r>
+            <w:proofErr w:type="gramEnd"/>
           </w:p>
         </w:tc>
         <w:tc>
@@ -6490,44 +6659,48 @@
           </w:p>
           <w:p>
             <w:pPr>
-              <w:jc w:val="center"/>
+              <w:jc w:val="both"/>
               <w:cnfStyle w:val="000000100000" w:firstRow="0" w:lastRow="0" w:firstColumn="0" w:lastColumn="0" w:oddVBand="0" w:evenVBand="0" w:oddHBand="1" w:evenHBand="0" w:firstRowFirstColumn="0" w:firstRowLastColumn="0" w:lastRowFirstColumn="0" w:lastRowLastColumn="0"/>
-              <w:rPr>
-                <w:rFonts w:eastAsia="MS Mincho" w:cstheme="minorHAnsi"/>
-                <w:bCs/>
-                <w:sz w:val="16"/>
-                <w:szCs w:val="16"/>
-              </w:rPr>
             </w:pPr>
             <w:r>
               <w:rPr>
-                <w:rFonts w:eastAsia="MS Mincho" w:cstheme="minorHAnsi"/>
-                <w:b/>
-                <w:bCs/>
+                <w:rFonts w:eastAsia="MS Mincho"/>
                 <w:sz w:val="16"/>
-                <w:szCs w:val="16"/>
+                <w:szCs w:val="18"/>
               </w:rPr>
               <w:t>{{</w:t>
             </w:r>
             <w:proofErr w:type="spellStart"/>
             <w:r>
               <w:rPr>
-                <w:rFonts w:eastAsia="MS Mincho" w:cstheme="minorHAnsi"/>
-                <w:b/>
-                <w:bCs/>
+                <w:rFonts w:eastAsia="MS Mincho"/>
                 <w:sz w:val="16"/>
-                <w:szCs w:val="16"/>
-              </w:rPr>
-              <w:t>fecha_inicio</w:t>
+                <w:szCs w:val="18"/>
+              </w:rPr>
+              <w:t>fecha</w:t>
+            </w:r>
+            <w:r>
+              <w:rPr>
+                <w:rFonts w:eastAsia="MS Mincho"/>
+                <w:sz w:val="16"/>
+                <w:szCs w:val="18"/>
+              </w:rPr>
+              <w:t>_</w:t>
+            </w:r>
+            <w:r>
+              <w:rPr>
+                <w:rFonts w:eastAsia="MS Mincho"/>
+                <w:sz w:val="16"/>
+                <w:szCs w:val="18"/>
+              </w:rPr>
+              <w:t>inicio_lit</w:t>
             </w:r>
             <w:proofErr w:type="spellEnd"/>
             <w:r>
               <w:rPr>
-                <w:rFonts w:eastAsia="MS Mincho" w:cstheme="minorHAnsi"/>
-                <w:b/>
-                <w:bCs/>
+                <w:rFonts w:eastAsia="MS Mincho"/>
                 <w:sz w:val="16"/>
-                <w:szCs w:val="16"/>
+                <w:szCs w:val="18"/>
               </w:rPr>
               <w:t>}}</w:t>
             </w:r>
@@ -6571,9 +6744,30 @@
                 <w:bCs/>
                 <w:sz w:val="16"/>
                 <w:szCs w:val="16"/>
-                <w:lang w:val="es-AR"/>
-              </w:rPr>
-              <w:t>52</w:t>
+              </w:rPr>
+              <w:t>{{</w:t>
+            </w:r>
+            <w:proofErr w:type="spellStart"/>
+            <w:r>
+              <w:rPr>
+                <w:rFonts w:eastAsia="MS Mincho" w:cstheme="minorHAnsi"/>
+                <w:b/>
+                <w:bCs/>
+                <w:sz w:val="16"/>
+                <w:szCs w:val="16"/>
+              </w:rPr>
+              <w:t>jornadas_a_trabajar</w:t>
+            </w:r>
+            <w:proofErr w:type="spellEnd"/>
+            <w:r>
+              <w:rPr>
+                <w:rFonts w:eastAsia="MS Mincho" w:cstheme="minorHAnsi"/>
+                <w:b/>
+                <w:bCs/>
+                <w:sz w:val="16"/>
+                <w:szCs w:val="16"/>
+              </w:rPr>
+              <w:t>}}</w:t>
             </w:r>
           </w:p>
         </w:tc>
@@ -6614,7 +6808,29 @@
                 <w:sz w:val="16"/>
                 <w:szCs w:val="16"/>
               </w:rPr>
-              <w:t>52</w:t>
+              <w:t>{{</w:t>
+            </w:r>
+            <w:proofErr w:type="spellStart"/>
+            <w:r>
+              <w:rPr>
+                <w:rFonts w:eastAsia="MS Mincho" w:cstheme="minorHAnsi"/>
+                <w:b/>
+                <w:bCs/>
+                <w:sz w:val="16"/>
+                <w:szCs w:val="16"/>
+              </w:rPr>
+              <w:t>jornadas_trabajadas</w:t>
+            </w:r>
+            <w:proofErr w:type="spellEnd"/>
+            <w:r>
+              <w:rPr>
+                <w:rFonts w:eastAsia="MS Mincho" w:cstheme="minorHAnsi"/>
+                <w:b/>
+                <w:bCs/>
+                <w:sz w:val="16"/>
+                <w:szCs w:val="16"/>
+              </w:rPr>
+              <w:t>}}</w:t>
             </w:r>
           </w:p>
         </w:tc>
@@ -6647,11 +6863,30 @@
               <w:rPr>
                 <w:rFonts w:eastAsia="MS Mincho" w:cstheme="minorHAnsi"/>
                 <w:b/>
-                <w:bCs/>
                 <w:sz w:val="14"/>
                 <w:szCs w:val="14"/>
               </w:rPr>
-              <w:t>Excelente</w:t>
+              <w:t>{{</w:t>
+            </w:r>
+            <w:proofErr w:type="spellStart"/>
+            <w:r>
+              <w:rPr>
+                <w:rFonts w:eastAsia="MS Mincho" w:cstheme="minorHAnsi"/>
+                <w:b/>
+                <w:sz w:val="14"/>
+                <w:szCs w:val="14"/>
+              </w:rPr>
+              <w:t>calificacion_asistencia</w:t>
+            </w:r>
+            <w:proofErr w:type="spellEnd"/>
+            <w:r>
+              <w:rPr>
+                <w:rFonts w:eastAsia="MS Mincho" w:cstheme="minorHAnsi"/>
+                <w:b/>
+                <w:sz w:val="14"/>
+                <w:szCs w:val="14"/>
+              </w:rPr>
+              <w:t>}}</w:t>
             </w:r>
           </w:p>
           <w:p>
@@ -6661,8 +6896,8 @@
               <w:rPr>
                 <w:rFonts w:eastAsia="MS Mincho" w:cstheme="minorHAnsi"/>
                 <w:bCs/>
-                <w:sz w:val="16"/>
-                <w:szCs w:val="16"/>
+                <w:sz w:val="14"/>
+                <w:szCs w:val="14"/>
               </w:rPr>
             </w:pPr>
             <w:r>
@@ -6672,17 +6907,57 @@
                 <w:sz w:val="14"/>
                 <w:szCs w:val="14"/>
               </w:rPr>
-              <w:t xml:space="preserve">Desempeño </w:t>
+              <w:t>Desempeño</w:t>
             </w:r>
             <w:r>
               <w:rPr>
                 <w:rFonts w:eastAsia="MS Mincho" w:cstheme="minorHAnsi"/>
-                <w:b/>
                 <w:bCs/>
                 <w:sz w:val="14"/>
                 <w:szCs w:val="14"/>
               </w:rPr>
-              <w:t>Bueno</w:t>
+              <w:t>:</w:t>
+            </w:r>
+          </w:p>
+          <w:p>
+            <w:pPr>
+              <w:jc w:val="center"/>
+              <w:cnfStyle w:val="000000100000" w:firstRow="0" w:lastRow="0" w:firstColumn="0" w:lastColumn="0" w:oddVBand="0" w:evenVBand="0" w:oddHBand="1" w:evenHBand="0" w:firstRowFirstColumn="0" w:firstRowLastColumn="0" w:lastRowFirstColumn="0" w:lastRowLastColumn="0"/>
+              <w:rPr>
+                <w:rFonts w:eastAsia="MS Mincho" w:cstheme="minorHAnsi"/>
+                <w:b/>
+                <w:sz w:val="16"/>
+                <w:szCs w:val="16"/>
+              </w:rPr>
+            </w:pPr>
+            <w:r>
+              <w:rPr>
+                <w:rFonts w:eastAsia="MS Mincho" w:cstheme="minorHAnsi"/>
+                <w:b/>
+                <w:sz w:val="14"/>
+                <w:szCs w:val="14"/>
+              </w:rPr>
+              <w:t>{{</w:t>
+            </w:r>
+            <w:proofErr w:type="spellStart"/>
+            <w:r>
+              <w:rPr>
+                <w:rFonts w:eastAsia="MS Mincho" w:cstheme="minorHAnsi"/>
+                <w:b/>
+                <w:sz w:val="14"/>
+                <w:szCs w:val="14"/>
+              </w:rPr>
+              <w:t>calificacion_desempeno</w:t>
+            </w:r>
+            <w:proofErr w:type="spellEnd"/>
+            <w:r>
+              <w:rPr>
+                <w:rFonts w:eastAsia="MS Mincho" w:cstheme="minorHAnsi"/>
+                <w:b/>
+                <w:sz w:val="14"/>
+                <w:szCs w:val="14"/>
+              </w:rPr>
+              <w:t>}}</w:t>
             </w:r>
           </w:p>
         </w:tc>
@@ -7159,7 +7434,7 @@
               <v:stroke joinstyle="miter"/>
               <v:path gradientshapeok="t" o:connecttype="rect"/>
             </v:shapetype>
-            <v:shape id="Cuadro de texto 2" o:spid="_x0000_s1026" type="#_x0000_t202" style="position:absolute;margin-left:0;margin-top:-23.65pt;width:213.2pt;height:21.25pt;z-index:251661312;visibility:visible;mso-wrap-style:square;mso-width-percent:0;mso-height-percent:0;mso-wrap-distance-left:9pt;mso-wrap-distance-top:3.6pt;mso-wrap-distance-right:9pt;mso-wrap-distance-bottom:3.6pt;mso-position-horizontal:center;mso-position-horizontal-relative:margin;mso-position-vertical:absolute;mso-position-vertical-relative:text;mso-width-percent:0;mso-height-percent:0;mso-width-relative:margin;mso-height-relative:margin;v-text-anchor:top" o:gfxdata="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" stroked="f">
+            <v:shape id="Cuadro de texto 2" o:spid="_x0000_s1026" type="#_x0000_t202" style="position:absolute;margin-left:0;margin-top:-23.65pt;width:213.2pt;height:21.25pt;z-index:251661312;visibility:visible;mso-wrap-style:square;mso-width-percent:0;mso-height-percent:0;mso-wrap-distance-left:9pt;mso-wrap-distance-top:3.6pt;mso-wrap-distance-right:9pt;mso-wrap-distance-bottom:3.6pt;mso-position-horizontal:center;mso-position-horizontal-relative:margin;mso-position-vertical:absolute;mso-position-vertical-relative:text;mso-width-percent:0;mso-height-percent:0;mso-width-relative:margin;mso-height-relative:margin;v-text-anchor:top" o:gfxdata="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" stroked="f">
               <v:textbox>
                 <w:txbxContent>
                   <w:p>

</xml_diff>